<commit_message>
Team 5 Assignments - Started organizing
</commit_message>
<xml_diff>
--- a/00_Project_Management/assignments/Milestone_5_Algorithms/Team5/M5_Pseudocode_Algorithms_Assignments_ Team5.docx
+++ b/00_Project_Management/assignments/Milestone_5_Algorithms/Team5/M5_Pseudocode_Algorithms_Assignments_ Team5.docx
@@ -76,20 +76,8 @@
           <w:color w:val="4EA72E" w:themeColor="accent6"/>
           <w:lang w:eastAsia="en-US"/>
         </w:rPr>
-        <w:t xml:space="preserve">, </w:t>
-      </w:r>
-      <w:proofErr w:type="gramStart"/>
-      <w:r>
-        <w:rPr>
-          <w:rFonts w:eastAsia="Times New Roman" w:cs="Times New Roman"/>
-          <w:b/>
-          <w:bCs/>
-          <w:color w:val="4EA72E" w:themeColor="accent6"/>
-          <w:lang w:eastAsia="en-US"/>
-        </w:rPr>
-        <w:t>2026</w:t>
-      </w:r>
-      <w:proofErr w:type="gramEnd"/>
+        <w:t>, 2026</w:t>
+      </w:r>
       <w:r>
         <w:rPr>
           <w:rFonts w:eastAsia="Times New Roman" w:cs="Times New Roman"/>
@@ -1018,6 +1006,46 @@
       <w:r>
         <w:t>Required List (15 Algorithms)</w:t>
       </w:r>
+      <w:r>
+        <w:t xml:space="preserve"> </w:t>
+      </w:r>
+      <w:r>
+        <w:rPr>
+          <w:rFonts w:eastAsia="Times New Roman" w:cs="Times New Roman"/>
+          <w:lang w:eastAsia="en-US"/>
+        </w:rPr>
+        <w:t xml:space="preserve">– </w:t>
+      </w:r>
+      <w:r>
+        <w:rPr>
+          <w:rFonts w:eastAsia="Times New Roman" w:cs="Times New Roman"/>
+          <w:b w:val="0"/>
+          <w:bCs w:val="0"/>
+          <w:color w:val="EE0000"/>
+          <w:lang w:eastAsia="en-US"/>
+        </w:rPr>
+        <w:t>Assign Wessley</w:t>
+      </w:r>
+      <w:r>
+        <w:rPr>
+          <w:rFonts w:eastAsia="Times New Roman" w:cs="Times New Roman"/>
+          <w:b w:val="0"/>
+          <w:bCs w:val="0"/>
+          <w:color w:val="EE0000"/>
+          <w:lang w:eastAsia="en-US"/>
+        </w:rPr>
+        <w:t xml:space="preserve"> – Team Assignments -&gt;</w:t>
+      </w:r>
+      <w:r>
+        <w:rPr>
+          <w:rFonts w:eastAsia="Times New Roman" w:cs="Times New Roman"/>
+          <w:b w:val="0"/>
+          <w:bCs w:val="0"/>
+          <w:color w:val="EE0000"/>
+          <w:lang w:eastAsia="en-US"/>
+        </w:rPr>
+        <w:t xml:space="preserve"> (15/5 = 3)</w:t>
+      </w:r>
     </w:p>
     <w:p>
       <w:pPr>
@@ -1064,6 +1092,21 @@
         </w:rPr>
         <w:t>)</w:t>
       </w:r>
+      <w:r>
+        <w:rPr>
+          <w:rFonts w:eastAsia="Times New Roman" w:cs="Times New Roman"/>
+          <w:lang w:eastAsia="en-US"/>
+        </w:rPr>
+        <w:t xml:space="preserve"> - </w:t>
+      </w:r>
+      <w:r>
+        <w:rPr>
+          <w:rFonts w:eastAsia="Times New Roman" w:cs="Times New Roman"/>
+          <w:color w:val="EE0000"/>
+          <w:lang w:eastAsia="en-US"/>
+        </w:rPr>
+        <w:t>William</w:t>
+      </w:r>
     </w:p>
     <w:p>
       <w:pPr>
@@ -1110,6 +1153,21 @@
         </w:rPr>
         <w:t xml:space="preserve">) </w:t>
       </w:r>
+      <w:r>
+        <w:rPr>
+          <w:rFonts w:eastAsia="Times New Roman" w:cs="Times New Roman"/>
+          <w:lang w:eastAsia="en-US"/>
+        </w:rPr>
+        <w:t xml:space="preserve">- </w:t>
+      </w:r>
+      <w:r>
+        <w:rPr>
+          <w:rFonts w:eastAsia="Times New Roman" w:cs="Times New Roman"/>
+          <w:color w:val="EE0000"/>
+          <w:lang w:eastAsia="en-US"/>
+        </w:rPr>
+        <w:t>William</w:t>
+      </w:r>
     </w:p>
     <w:p>
       <w:pPr>
@@ -1156,6 +1214,21 @@
         </w:rPr>
         <w:t xml:space="preserve">) </w:t>
       </w:r>
+      <w:r>
+        <w:rPr>
+          <w:rFonts w:eastAsia="Times New Roman" w:cs="Times New Roman"/>
+          <w:lang w:eastAsia="en-US"/>
+        </w:rPr>
+        <w:t xml:space="preserve">- </w:t>
+      </w:r>
+      <w:r>
+        <w:rPr>
+          <w:rFonts w:eastAsia="Times New Roman" w:cs="Times New Roman"/>
+          <w:color w:val="EE0000"/>
+          <w:lang w:eastAsia="en-US"/>
+        </w:rPr>
+        <w:t>William</w:t>
+      </w:r>
     </w:p>
     <w:p>
       <w:pPr>
@@ -1202,6 +1275,21 @@
         </w:rPr>
         <w:t xml:space="preserve">) </w:t>
       </w:r>
+      <w:r>
+        <w:rPr>
+          <w:rFonts w:eastAsia="Times New Roman" w:cs="Times New Roman"/>
+          <w:lang w:eastAsia="en-US"/>
+        </w:rPr>
+        <w:t xml:space="preserve">- </w:t>
+      </w:r>
+      <w:r>
+        <w:rPr>
+          <w:rFonts w:eastAsia="Times New Roman" w:cs="Times New Roman"/>
+          <w:color w:val="EE0000"/>
+          <w:lang w:eastAsia="en-US"/>
+        </w:rPr>
+        <w:t>William</w:t>
+      </w:r>
     </w:p>
     <w:p>
       <w:pPr>
@@ -1248,6 +1336,21 @@
         </w:rPr>
         <w:t xml:space="preserve">) </w:t>
       </w:r>
+      <w:r>
+        <w:rPr>
+          <w:rFonts w:eastAsia="Times New Roman" w:cs="Times New Roman"/>
+          <w:lang w:eastAsia="en-US"/>
+        </w:rPr>
+        <w:t xml:space="preserve">- </w:t>
+      </w:r>
+      <w:r>
+        <w:rPr>
+          <w:rFonts w:eastAsia="Times New Roman" w:cs="Times New Roman"/>
+          <w:color w:val="EE0000"/>
+          <w:lang w:eastAsia="en-US"/>
+        </w:rPr>
+        <w:t>William</w:t>
+      </w:r>
     </w:p>
     <w:p>
       <w:pPr>
@@ -1294,6 +1397,28 @@
         </w:rPr>
         <w:t>)</w:t>
       </w:r>
+      <w:r>
+        <w:rPr>
+          <w:rFonts w:eastAsia="Times New Roman" w:cs="Times New Roman"/>
+          <w:lang w:eastAsia="en-US"/>
+        </w:rPr>
+        <w:t xml:space="preserve"> </w:t>
+      </w:r>
+      <w:r>
+        <w:rPr>
+          <w:rFonts w:eastAsia="Times New Roman" w:cs="Times New Roman"/>
+          <w:lang w:eastAsia="en-US"/>
+        </w:rPr>
+        <w:t xml:space="preserve">- </w:t>
+      </w:r>
+      <w:r>
+        <w:rPr>
+          <w:rFonts w:eastAsia="Times New Roman" w:cs="Times New Roman"/>
+          <w:color w:val="EE0000"/>
+          <w:lang w:eastAsia="en-US"/>
+        </w:rPr>
+        <w:t>William</w:t>
+      </w:r>
     </w:p>
     <w:p>
       <w:pPr>
@@ -1340,6 +1465,21 @@
         </w:rPr>
         <w:t xml:space="preserve">) </w:t>
       </w:r>
+      <w:r>
+        <w:rPr>
+          <w:rFonts w:eastAsia="Times New Roman" w:cs="Times New Roman"/>
+          <w:lang w:eastAsia="en-US"/>
+        </w:rPr>
+        <w:t xml:space="preserve">- </w:t>
+      </w:r>
+      <w:r>
+        <w:rPr>
+          <w:rFonts w:eastAsia="Times New Roman" w:cs="Times New Roman"/>
+          <w:color w:val="EE0000"/>
+          <w:lang w:eastAsia="en-US"/>
+        </w:rPr>
+        <w:t>Ethan S.</w:t>
+      </w:r>
     </w:p>
     <w:p>
       <w:pPr>
@@ -1386,6 +1526,21 @@
         </w:rPr>
         <w:t xml:space="preserve">) </w:t>
       </w:r>
+      <w:r>
+        <w:rPr>
+          <w:rFonts w:eastAsia="Times New Roman" w:cs="Times New Roman"/>
+          <w:lang w:eastAsia="en-US"/>
+        </w:rPr>
+        <w:t xml:space="preserve">- </w:t>
+      </w:r>
+      <w:r>
+        <w:rPr>
+          <w:rFonts w:eastAsia="Times New Roman" w:cs="Times New Roman"/>
+          <w:color w:val="EE0000"/>
+          <w:lang w:eastAsia="en-US"/>
+        </w:rPr>
+        <w:t>Dallin</w:t>
+      </w:r>
     </w:p>
     <w:p>
       <w:pPr>
@@ -1432,6 +1587,21 @@
         </w:rPr>
         <w:t xml:space="preserve">) </w:t>
       </w:r>
+      <w:r>
+        <w:rPr>
+          <w:rFonts w:eastAsia="Times New Roman" w:cs="Times New Roman"/>
+          <w:lang w:eastAsia="en-US"/>
+        </w:rPr>
+        <w:t xml:space="preserve">- </w:t>
+      </w:r>
+      <w:r>
+        <w:rPr>
+          <w:rFonts w:eastAsia="Times New Roman" w:cs="Times New Roman"/>
+          <w:color w:val="EE0000"/>
+          <w:lang w:eastAsia="en-US"/>
+        </w:rPr>
+        <w:t>Dallin</w:t>
+      </w:r>
     </w:p>
     <w:p>
       <w:pPr>
@@ -1485,6 +1655,21 @@
         </w:rPr>
         <w:t xml:space="preserve"> </w:t>
       </w:r>
+      <w:r>
+        <w:rPr>
+          <w:rFonts w:eastAsia="Times New Roman" w:cs="Times New Roman"/>
+          <w:lang w:eastAsia="en-US"/>
+        </w:rPr>
+        <w:t xml:space="preserve">- </w:t>
+      </w:r>
+      <w:r>
+        <w:rPr>
+          <w:rFonts w:eastAsia="Times New Roman" w:cs="Times New Roman"/>
+          <w:color w:val="EE0000"/>
+          <w:lang w:eastAsia="en-US"/>
+        </w:rPr>
+        <w:t>Dallin</w:t>
+      </w:r>
     </w:p>
     <w:p>
       <w:pPr>
@@ -1531,6 +1716,21 @@
         </w:rPr>
         <w:t xml:space="preserve">) </w:t>
       </w:r>
+      <w:r>
+        <w:rPr>
+          <w:rFonts w:eastAsia="Times New Roman" w:cs="Times New Roman"/>
+          <w:lang w:eastAsia="en-US"/>
+        </w:rPr>
+        <w:t xml:space="preserve">- </w:t>
+      </w:r>
+      <w:r>
+        <w:rPr>
+          <w:rFonts w:eastAsia="Times New Roman" w:cs="Times New Roman"/>
+          <w:color w:val="EE0000"/>
+          <w:lang w:eastAsia="en-US"/>
+        </w:rPr>
+        <w:t>Dallin</w:t>
+      </w:r>
     </w:p>
     <w:p>
       <w:pPr>
@@ -1577,6 +1777,21 @@
         </w:rPr>
         <w:t xml:space="preserve">) </w:t>
       </w:r>
+      <w:r>
+        <w:rPr>
+          <w:rFonts w:eastAsia="Times New Roman" w:cs="Times New Roman"/>
+          <w:lang w:eastAsia="en-US"/>
+        </w:rPr>
+        <w:t xml:space="preserve">- </w:t>
+      </w:r>
+      <w:r>
+        <w:rPr>
+          <w:rFonts w:eastAsia="Times New Roman" w:cs="Times New Roman"/>
+          <w:color w:val="EE0000"/>
+          <w:lang w:eastAsia="en-US"/>
+        </w:rPr>
+        <w:t>Dallin</w:t>
+      </w:r>
     </w:p>
     <w:p>
       <w:pPr>
@@ -1623,6 +1838,21 @@
         </w:rPr>
         <w:t xml:space="preserve">) </w:t>
       </w:r>
+      <w:r>
+        <w:rPr>
+          <w:rFonts w:eastAsia="Times New Roman" w:cs="Times New Roman"/>
+          <w:lang w:eastAsia="en-US"/>
+        </w:rPr>
+        <w:t xml:space="preserve">- </w:t>
+      </w:r>
+      <w:r>
+        <w:rPr>
+          <w:rFonts w:eastAsia="Times New Roman" w:cs="Times New Roman"/>
+          <w:color w:val="EE0000"/>
+          <w:lang w:eastAsia="en-US"/>
+        </w:rPr>
+        <w:t>William</w:t>
+      </w:r>
     </w:p>
     <w:p>
       <w:pPr>
@@ -1669,6 +1899,21 @@
         </w:rPr>
         <w:t xml:space="preserve">) </w:t>
       </w:r>
+      <w:r>
+        <w:rPr>
+          <w:rFonts w:eastAsia="Times New Roman" w:cs="Times New Roman"/>
+          <w:lang w:eastAsia="en-US"/>
+        </w:rPr>
+        <w:t xml:space="preserve">- </w:t>
+      </w:r>
+      <w:r>
+        <w:rPr>
+          <w:rFonts w:eastAsia="Times New Roman" w:cs="Times New Roman"/>
+          <w:color w:val="EE0000"/>
+          <w:lang w:eastAsia="en-US"/>
+        </w:rPr>
+        <w:t>Ethan S.</w:t>
+      </w:r>
     </w:p>
     <w:p>
       <w:pPr>
@@ -1714,6 +1959,28 @@
           <w:lang w:eastAsia="en-US"/>
         </w:rPr>
         <w:t>)</w:t>
+      </w:r>
+      <w:r>
+        <w:rPr>
+          <w:rFonts w:eastAsia="Times New Roman" w:cs="Times New Roman"/>
+          <w:lang w:eastAsia="en-US"/>
+        </w:rPr>
+        <w:t xml:space="preserve"> </w:t>
+      </w:r>
+      <w:r>
+        <w:rPr>
+          <w:rFonts w:eastAsia="Times New Roman" w:cs="Times New Roman"/>
+          <w:lang w:eastAsia="en-US"/>
+        </w:rPr>
+        <w:t xml:space="preserve">- </w:t>
+      </w:r>
+      <w:r>
+        <w:rPr>
+          <w:rFonts w:eastAsia="Times New Roman" w:cs="Times New Roman"/>
+          <w:color w:val="EE0000"/>
+          <w:lang w:eastAsia="en-US"/>
+        </w:rPr>
+        <w:t>Adam</w:t>
       </w:r>
     </w:p>
     <w:p>
@@ -2065,23 +2332,7 @@
           <w:rFonts w:eastAsia="Times New Roman" w:cs="Times New Roman"/>
           <w:lang w:eastAsia="en-US"/>
         </w:rPr>
-        <w:t xml:space="preserve">Pseudocode is language independent. This means one should be able to write pseudocode without having to think about the specific style, syntax, or capabilities of </w:t>
-      </w:r>
-      <w:proofErr w:type="gramStart"/>
-      <w:r>
-        <w:rPr>
-          <w:rFonts w:eastAsia="Times New Roman" w:cs="Times New Roman"/>
-          <w:lang w:eastAsia="en-US"/>
-        </w:rPr>
-        <w:t>any one</w:t>
-      </w:r>
-      <w:proofErr w:type="gramEnd"/>
-      <w:r>
-        <w:rPr>
-          <w:rFonts w:eastAsia="Times New Roman" w:cs="Times New Roman"/>
-          <w:lang w:eastAsia="en-US"/>
-        </w:rPr>
-        <w:t xml:space="preserve"> programming language. It also means a single pseudocode design should be readily translatable into a variety of programming languages.</w:t>
+        <w:t>Pseudocode is language independent. This means one should be able to write pseudocode without having to think about the specific style, syntax, or capabilities of any one programming language. It also means a single pseudocode design should be readily translatable into a variety of programming languages.</w:t>
       </w:r>
     </w:p>
     <w:p>
@@ -2106,23 +2357,7 @@
           <w:rFonts w:eastAsia="Times New Roman" w:cs="Times New Roman"/>
           <w:lang w:eastAsia="en-US"/>
         </w:rPr>
-        <w:t xml:space="preserve">Pseudocode has several rules, but these rules are less strictly enforced than those for compiled programming languages. The goal here is to represent design ideas. In other words, pseudocode is a means to an end, not an </w:t>
-      </w:r>
-      <w:proofErr w:type="gramStart"/>
-      <w:r>
-        <w:rPr>
-          <w:rFonts w:eastAsia="Times New Roman" w:cs="Times New Roman"/>
-          <w:lang w:eastAsia="en-US"/>
-        </w:rPr>
-        <w:t>end in itself</w:t>
-      </w:r>
-      <w:proofErr w:type="gramEnd"/>
-      <w:r>
-        <w:rPr>
-          <w:rFonts w:eastAsia="Times New Roman" w:cs="Times New Roman"/>
-          <w:lang w:eastAsia="en-US"/>
-        </w:rPr>
-        <w:t>.</w:t>
+        <w:t>Pseudocode has several rules, but these rules are less strictly enforced than those for compiled programming languages. The goal here is to represent design ideas. In other words, pseudocode is a means to an end, not an end in itself.</w:t>
       </w:r>
     </w:p>
     <w:p>
@@ -2190,6 +2425,7 @@
         <w:pStyle w:val="BestPractices"/>
       </w:pPr>
       <w:r>
+        <w:lastRenderedPageBreak/>
         <w:t>Rule 0.2.4 Use actual variable names and equations</w:t>
       </w:r>
     </w:p>
@@ -2888,10 +3124,10 @@
         <w:tblLook w:val="04A0" w:firstRow="1" w:lastRow="0" w:firstColumn="1" w:lastColumn="0" w:noHBand="0" w:noVBand="1"/>
       </w:tblPr>
       <w:tblGrid>
-        <w:gridCol w:w="3080"/>
+        <w:gridCol w:w="3107"/>
         <w:gridCol w:w="222"/>
-        <w:gridCol w:w="2862"/>
-        <w:gridCol w:w="3131"/>
+        <w:gridCol w:w="2849"/>
+        <w:gridCol w:w="3117"/>
       </w:tblGrid>
       <w:tr>
         <w:trPr>
@@ -4716,10 +4952,10 @@
         <w:tblLook w:val="04A0" w:firstRow="1" w:lastRow="0" w:firstColumn="1" w:lastColumn="0" w:noHBand="0" w:noVBand="1"/>
       </w:tblPr>
       <w:tblGrid>
-        <w:gridCol w:w="3265"/>
+        <w:gridCol w:w="3311"/>
         <w:gridCol w:w="236"/>
         <w:gridCol w:w="2250"/>
-        <w:gridCol w:w="3544"/>
+        <w:gridCol w:w="3498"/>
       </w:tblGrid>
       <w:tr>
         <w:trPr>
@@ -5088,22 +5324,13 @@
                 <w:lang w:eastAsia="en-US"/>
               </w:rPr>
             </w:pPr>
-            <w:proofErr w:type="spellStart"/>
             <w:proofErr w:type="gramStart"/>
             <w:r>
               <w:rPr>
                 <w:rFonts w:eastAsia="Times New Roman" w:cs="Times New Roman"/>
                 <w:lang w:eastAsia="en-US"/>
               </w:rPr>
-              <w:t>editJobPosting</w:t>
-            </w:r>
-            <w:proofErr w:type="spellEnd"/>
-            <w:r>
-              <w:rPr>
-                <w:rFonts w:eastAsia="Times New Roman" w:cs="Times New Roman"/>
-                <w:lang w:eastAsia="en-US"/>
-              </w:rPr>
-              <w:t>(</w:t>
+              <w:t>editJobPosting(</w:t>
             </w:r>
             <w:proofErr w:type="gramEnd"/>
             <w:r>
@@ -6171,21 +6398,12 @@
                 <w:lang w:eastAsia="en-US"/>
               </w:rPr>
             </w:pPr>
-            <w:proofErr w:type="gramStart"/>
-            <w:r>
-              <w:rPr>
-                <w:rFonts w:eastAsia="Times New Roman" w:cs="Times New Roman"/>
-                <w:lang w:eastAsia="en-US"/>
-              </w:rPr>
-              <w:t>Search</w:t>
-            </w:r>
-            <w:proofErr w:type="gramEnd"/>
-            <w:r>
-              <w:rPr>
-                <w:rFonts w:eastAsia="Times New Roman" w:cs="Times New Roman"/>
-                <w:lang w:eastAsia="en-US"/>
-              </w:rPr>
-              <w:t xml:space="preserve"> autocomplete coordinator</w:t>
+            <w:r>
+              <w:rPr>
+                <w:rFonts w:eastAsia="Times New Roman" w:cs="Times New Roman"/>
+                <w:lang w:eastAsia="en-US"/>
+              </w:rPr>
+              <w:t>Search autocomplete coordinator</w:t>
             </w:r>
           </w:p>
         </w:tc>
@@ -6404,21 +6622,12 @@
                 <w:lang w:eastAsia="en-US"/>
               </w:rPr>
             </w:pPr>
-            <w:proofErr w:type="gramStart"/>
-            <w:r>
-              <w:rPr>
-                <w:rFonts w:eastAsia="Times New Roman" w:cs="Times New Roman"/>
-                <w:lang w:eastAsia="en-US"/>
-              </w:rPr>
-              <w:t>Converts</w:t>
-            </w:r>
-            <w:proofErr w:type="gramEnd"/>
-            <w:r>
-              <w:rPr>
-                <w:rFonts w:eastAsia="Times New Roman" w:cs="Times New Roman"/>
-                <w:lang w:eastAsia="en-US"/>
-              </w:rPr>
-              <w:t xml:space="preserve"> wildcards to query expressions</w:t>
+            <w:r>
+              <w:rPr>
+                <w:rFonts w:eastAsia="Times New Roman" w:cs="Times New Roman"/>
+                <w:lang w:eastAsia="en-US"/>
+              </w:rPr>
+              <w:t>Converts wildcards to query expressions</w:t>
             </w:r>
           </w:p>
         </w:tc>
@@ -7996,21 +8205,12 @@
                 <w:lang w:eastAsia="en-US"/>
               </w:rPr>
             </w:pPr>
-            <w:proofErr w:type="gramStart"/>
-            <w:r>
-              <w:rPr>
-                <w:rFonts w:eastAsia="Times New Roman" w:cs="Times New Roman"/>
-                <w:lang w:eastAsia="en-US"/>
-              </w:rPr>
-              <w:t>Builds</w:t>
-            </w:r>
-            <w:proofErr w:type="gramEnd"/>
-            <w:r>
-              <w:rPr>
-                <w:rFonts w:eastAsia="Times New Roman" w:cs="Times New Roman"/>
-                <w:lang w:eastAsia="en-US"/>
-              </w:rPr>
-              <w:t xml:space="preserve"> summary data</w:t>
+            <w:r>
+              <w:rPr>
+                <w:rFonts w:eastAsia="Times New Roman" w:cs="Times New Roman"/>
+                <w:lang w:eastAsia="en-US"/>
+              </w:rPr>
+              <w:t>Builds summary data</w:t>
             </w:r>
           </w:p>
         </w:tc>
@@ -8117,21 +8317,12 @@
                 <w:lang w:eastAsia="en-US"/>
               </w:rPr>
             </w:pPr>
-            <w:proofErr w:type="gramStart"/>
-            <w:r>
-              <w:rPr>
-                <w:rFonts w:eastAsia="Times New Roman" w:cs="Times New Roman"/>
-                <w:lang w:eastAsia="en-US"/>
-              </w:rPr>
-              <w:t>Loads</w:t>
-            </w:r>
-            <w:proofErr w:type="gramEnd"/>
-            <w:r>
-              <w:rPr>
-                <w:rFonts w:eastAsia="Times New Roman" w:cs="Times New Roman"/>
-                <w:lang w:eastAsia="en-US"/>
-              </w:rPr>
-              <w:t xml:space="preserve"> analytics dashboard</w:t>
+            <w:r>
+              <w:rPr>
+                <w:rFonts w:eastAsia="Times New Roman" w:cs="Times New Roman"/>
+                <w:lang w:eastAsia="en-US"/>
+              </w:rPr>
+              <w:t>Loads analytics dashboard</w:t>
             </w:r>
           </w:p>
         </w:tc>
@@ -8999,10 +9190,10 @@
         <w:tblLook w:val="04A0" w:firstRow="1" w:lastRow="0" w:firstColumn="1" w:lastColumn="0" w:noHBand="0" w:noVBand="1"/>
       </w:tblPr>
       <w:tblGrid>
-        <w:gridCol w:w="2977"/>
+        <w:gridCol w:w="3029"/>
         <w:gridCol w:w="222"/>
-        <w:gridCol w:w="3390"/>
-        <w:gridCol w:w="2706"/>
+        <w:gridCol w:w="3358"/>
+        <w:gridCol w:w="2686"/>
       </w:tblGrid>
       <w:tr>
         <w:trPr>

</xml_diff>

<commit_message>
Milestone 5 Team 5
</commit_message>
<xml_diff>
--- a/00_Project_Management/assignments/Milestone_5_Algorithms/Team5/M5_Pseudocode_Algorithms_Assignments_ Team5.docx
+++ b/00_Project_Management/assignments/Milestone_5_Algorithms/Team5/M5_Pseudocode_Algorithms_Assignments_ Team5.docx
@@ -1024,17 +1024,7 @@
           <w:color w:val="EE0000"/>
           <w:lang w:eastAsia="en-US"/>
         </w:rPr>
-        <w:t>Assign Wessley</w:t>
-      </w:r>
-      <w:r>
-        <w:rPr>
-          <w:rFonts w:eastAsia="Times New Roman" w:cs="Times New Roman"/>
-          <w:b w:val="0"/>
-          <w:bCs w:val="0"/>
-          <w:color w:val="EE0000"/>
-          <w:lang w:eastAsia="en-US"/>
-        </w:rPr>
-        <w:t xml:space="preserve"> – Team Assignments -&gt;</w:t>
+        <w:t>Assignments -&gt;</w:t>
       </w:r>
       <w:r>
         <w:rPr>
@@ -1105,7 +1095,15 @@
           <w:color w:val="EE0000"/>
           <w:lang w:eastAsia="en-US"/>
         </w:rPr>
-        <w:t>William</w:t>
+        <w:t>W</w:t>
+      </w:r>
+      <w:r>
+        <w:rPr>
+          <w:rFonts w:eastAsia="Times New Roman" w:cs="Times New Roman"/>
+          <w:color w:val="EE0000"/>
+          <w:lang w:eastAsia="en-US"/>
+        </w:rPr>
+        <w:t>essly</w:t>
       </w:r>
     </w:p>
     <w:p>
@@ -1166,7 +1164,15 @@
           <w:color w:val="EE0000"/>
           <w:lang w:eastAsia="en-US"/>
         </w:rPr>
-        <w:t>William</w:t>
+        <w:t>W</w:t>
+      </w:r>
+      <w:r>
+        <w:rPr>
+          <w:rFonts w:eastAsia="Times New Roman" w:cs="Times New Roman"/>
+          <w:color w:val="EE0000"/>
+          <w:lang w:eastAsia="en-US"/>
+        </w:rPr>
+        <w:t>essly</w:t>
       </w:r>
     </w:p>
     <w:p>
@@ -1227,7 +1233,15 @@
           <w:color w:val="EE0000"/>
           <w:lang w:eastAsia="en-US"/>
         </w:rPr>
-        <w:t>William</w:t>
+        <w:t>W</w:t>
+      </w:r>
+      <w:r>
+        <w:rPr>
+          <w:rFonts w:eastAsia="Times New Roman" w:cs="Times New Roman"/>
+          <w:color w:val="EE0000"/>
+          <w:lang w:eastAsia="en-US"/>
+        </w:rPr>
+        <w:t>essly</w:t>
       </w:r>
     </w:p>
     <w:p>
@@ -1402,14 +1416,7 @@
           <w:rFonts w:eastAsia="Times New Roman" w:cs="Times New Roman"/>
           <w:lang w:eastAsia="en-US"/>
         </w:rPr>
-        <w:t xml:space="preserve"> </w:t>
-      </w:r>
-      <w:r>
-        <w:rPr>
-          <w:rFonts w:eastAsia="Times New Roman" w:cs="Times New Roman"/>
-          <w:lang w:eastAsia="en-US"/>
-        </w:rPr>
-        <w:t xml:space="preserve">- </w:t>
+        <w:t xml:space="preserve"> - </w:t>
       </w:r>
       <w:r>
         <w:rPr>
@@ -1729,7 +1736,7 @@
           <w:color w:val="EE0000"/>
           <w:lang w:eastAsia="en-US"/>
         </w:rPr>
-        <w:t>Dallin</w:t>
+        <w:t>Adam</w:t>
       </w:r>
     </w:p>
     <w:p>
@@ -1790,7 +1797,7 @@
           <w:color w:val="EE0000"/>
           <w:lang w:eastAsia="en-US"/>
         </w:rPr>
-        <w:t>Dallin</w:t>
+        <w:t>Adam</w:t>
       </w:r>
     </w:p>
     <w:p>
@@ -1851,7 +1858,7 @@
           <w:color w:val="EE0000"/>
           <w:lang w:eastAsia="en-US"/>
         </w:rPr>
-        <w:t>William</w:t>
+        <w:t>Ethan S.</w:t>
       </w:r>
     </w:p>
     <w:p>
@@ -1965,14 +1972,7 @@
           <w:rFonts w:eastAsia="Times New Roman" w:cs="Times New Roman"/>
           <w:lang w:eastAsia="en-US"/>
         </w:rPr>
-        <w:t xml:space="preserve"> </w:t>
-      </w:r>
-      <w:r>
-        <w:rPr>
-          <w:rFonts w:eastAsia="Times New Roman" w:cs="Times New Roman"/>
-          <w:lang w:eastAsia="en-US"/>
-        </w:rPr>
-        <w:t xml:space="preserve">- </w:t>
+        <w:t xml:space="preserve"> - </w:t>
       </w:r>
       <w:r>
         <w:rPr>

</xml_diff>